<commit_message>
Epic I complete: translation links read both ways; stale translations visible in the document list
- I2-T3 (FR-803): Document::source() and translations(); GET /documents/{id}
  and /published return `source` and `translations` ({id, language, title,
  state, translation_stale}), each only when the caller can open it, and the
  published payload lists only translations that are published themselves.
  Reader shows "Translated from XX" / "Also in DE FR*"; editor links to the
  source and its translations; the assist panel refuses a second translation
  in the same language before the server's 409.
- I3-T2 (FR-804): the space browser tags translations with their language
  and "out of date" when the source was re-approved; reader and editor
  banners link to the source.
- Doc 05 v1.5; backlog Epic I 10/10.

Co-Authored-By: Claude Fable 5.1 <noreply@anthropic.com>
Claude-Session: https://claude.ai/code/session_01RD5kD4obV2Jan7tMKpiqPQ
</commit_message>
<xml_diff>
--- a/Documentation/05-API-Specification.docx
+++ b/Documentation/05-API-Specification.docx
@@ -65,7 +65,7 @@
           <w:sz w:val="20"/>
           <w:szCs w:val="20"/>
         </w:rPr>
-        <w:t>Version 1.4  ·  Project documentation  ·  2026</w:t>
+        <w:t>Version 1.5  ·  Project documentation  ·  2026</w:t>
       </w:r>
     </w:p>
     <w:p>
@@ -9512,6 +9512,21 @@
           <w:szCs w:val="20"/>
         </w:rPr>
         <w:t>Filters (v1.3). doc_type, owner_id and the approval-date range (approved_after / approved_before, YYYY-MM-DD, inclusive, UTC) are applied inside both retrieval legs, never after ranking, so a filter narrows the result list rather than emptying a page of unrelated hits. Results are the approved version of each document — including a document whose next revision is being drafted — so the date filters use the approval date, not the last edit. updated_after from v1.2 is replaced by approved_after.</w:t>
+      </w:r>
+    </w:p>
+    <w:p>
+      <w:pPr>
+        <w:spacing w:after="140" w:before="60" w:line="276"/>
+        <w:jc w:val="left"/>
+      </w:pPr>
+      <w:r>
+        <w:rPr>
+          <w:rFonts w:ascii="Calibri" w:cs="Calibri" w:eastAsia="Calibri" w:hAnsi="Calibri"/>
+          <w:color w:val="1A1A1A"/>
+          <w:sz w:val="20"/>
+          <w:szCs w:val="20"/>
+        </w:rPr>
+        <w:t>Translation links (v1.5, I2-T3). GET /documents/{id} and GET /documents/{id}/published carry the link both ways: source — {id, language, title, state, translation_stale} of the document this one was translated from, or null; translations — the same shape for each translation of this document, one per language. Each end is present only when the caller can open it; the published payload lists only translations that are themselves published. POST /ai/translate answers 409 when a translation in that language already exists.</w:t>
       </w:r>
     </w:p>
     <w:p>

</xml_diff>